<commit_message>
sales-summary: grant front-desk access (branch-scoped); handbook: 1-click PDF/Word export + matrix sync
- Sales Summary sidebar link + page guard now include AHEA/AHGH front desk;
  APIs already permitted them (reads open, With-SI writes already in WRITE_ROLES,
  target edit stays admin-only). Branch scope locks front desk to their branch.
- Handbook: clearer Download Word / Download PDF buttons + print CSS so images
  and headings don't split across pages; access matrix + Front Desk guide updated
  to show Sales Summary; Word doc regenerated.

Co-Authored-By: Claude Opus 4.8 <noreply@anthropic.com>
</commit_message>
<xml_diff>
--- a/accounting-hub/public/Accounting-Hub-User-Handbook.docx
+++ b/accounting-hub/public/Accounting-Hub-User-Handbook.docx
@@ -3841,11 +3841,11 @@
               <w:rPr>
                 <w:b w:val="false"/>
                 <w:bCs w:val="false"/>
-                <w:color w:val="9AA4AC"/>
-                <w:sz w:val="18"/>
-                <w:szCs w:val="18"/>
-              </w:rPr>
-              <w:t xml:space="preserve">—</w:t>
+                <w:color w:val="0F5C4C"/>
+                <w:sz w:val="18"/>
+                <w:szCs w:val="18"/>
+              </w:rPr>
+              <w:t xml:space="preserve">✔</w:t>
             </w:r>
           </w:p>
         </w:tc>
@@ -5201,7 +5201,7 @@
           <w:sz w:val="21"/>
           <w:szCs w:val="21"/>
         </w:rPr>
-        <w:t xml:space="preserve">Cashier and first point of contact. You can open Point of Sale, Services, Asset Management, PayMongo, Dashboard, and Referral — for your branch.</w:t>
+        <w:t xml:space="preserve">Cashier and first point of contact. You can open Point of Sale, Services, Asset Management, PayMongo, Dashboard, Sales Summary, and Referral — for your branch.</w:t>
       </w:r>
     </w:p>
     <w:p>

</xml_diff>